<commit_message>
Update site - 2026-03-28 17-50
</commit_message>
<xml_diff>
--- a/Audit-SEO-Solarglobe-Mars2026.docx
+++ b/Audit-SEO-Solarglobe-Mars2026.docx
@@ -7909,8 +7909,14 @@
             </w:tcMar>
           </w:tcPr>
           <w:p>
-            <w:r>
-              <w:rPr>
+            <w:pPr>
+              <w:rPr>
+                <w:strike/>
+              </w:rPr>
+            </w:pPr>
+            <w:r>
+              <w:rPr>
+                <w:strike/>
                 <w:color w:val="1A1A1A"/>
               </w:rPr>
               <w:t xml:space="preserve">  7. Télécharger Montserrat en local et supprimer l’appel fonts.googleapis.com</w:t>
@@ -7937,15 +7943,28 @@
             </w:tcMar>
           </w:tcPr>
           <w:p>
+            <w:pPr>
+              <w:rPr>
+                <w:strike/>
+              </w:rPr>
+            </w:pPr>
             <w:r>
               <w:rPr>
                 <w:color w:val="1A1A1A"/>
               </w:rPr>
-              <w:t xml:space="preserve">  8. Compiler </w:t>
+              <w:t xml:space="preserve">  </w:t>
+            </w:r>
+            <w:r>
+              <w:rPr>
+                <w:strike/>
+                <w:color w:val="1A1A1A"/>
+              </w:rPr>
+              <w:t xml:space="preserve">8. Compiler </w:t>
             </w:r>
             <w:proofErr w:type="spellStart"/>
             <w:r>
               <w:rPr>
+                <w:strike/>
                 <w:color w:val="1A1A1A"/>
               </w:rPr>
               <w:t>Tailwind</w:t>
@@ -7953,6 +7972,7 @@
             <w:proofErr w:type="spellEnd"/>
             <w:r>
               <w:rPr>
+                <w:strike/>
                 <w:color w:val="1A1A1A"/>
               </w:rPr>
               <w:t xml:space="preserve"> CSS en production (CLI ou Vite) et supprimer le CDN</w:t>
@@ -7979,8 +7999,14 @@
             </w:tcMar>
           </w:tcPr>
           <w:p>
-            <w:r>
-              <w:rPr>
+            <w:pPr>
+              <w:rPr>
+                <w:strike/>
+              </w:rPr>
+            </w:pPr>
+            <w:r>
+              <w:rPr>
+                <w:strike/>
                 <w:color w:val="1A1A1A"/>
               </w:rPr>
               <w:t xml:space="preserve">  9. Ajouter un </w:t>
@@ -7988,6 +8014,7 @@
             <w:proofErr w:type="spellStart"/>
             <w:r>
               <w:rPr>
+                <w:strike/>
                 <w:color w:val="1A1A1A"/>
               </w:rPr>
               <w:t>schema</w:t>
@@ -7995,6 +8022,7 @@
             <w:proofErr w:type="spellEnd"/>
             <w:r>
               <w:rPr>
+                <w:strike/>
                 <w:color w:val="1A1A1A"/>
               </w:rPr>
               <w:t xml:space="preserve"> </w:t>
@@ -8002,6 +8030,7 @@
             <w:proofErr w:type="spellStart"/>
             <w:r>
               <w:rPr>
+                <w:strike/>
                 <w:color w:val="1A1A1A"/>
               </w:rPr>
               <w:t>AggregateRating</w:t>
@@ -8009,6 +8038,7 @@
             <w:proofErr w:type="spellEnd"/>
             <w:r>
               <w:rPr>
+                <w:strike/>
                 <w:color w:val="1A1A1A"/>
               </w:rPr>
               <w:t xml:space="preserve"> avec lien Google </w:t>
@@ -8016,6 +8046,7 @@
             <w:proofErr w:type="spellStart"/>
             <w:r>
               <w:rPr>
+                <w:strike/>
                 <w:color w:val="1A1A1A"/>
               </w:rPr>
               <w:t>My</w:t>
@@ -8023,6 +8054,7 @@
             <w:proofErr w:type="spellEnd"/>
             <w:r>
               <w:rPr>
+                <w:strike/>
                 <w:color w:val="1A1A1A"/>
               </w:rPr>
               <w:t xml:space="preserve"> Business</w:t>
@@ -8049,8 +8081,14 @@
             </w:tcMar>
           </w:tcPr>
           <w:p>
-            <w:r>
-              <w:rPr>
+            <w:pPr>
+              <w:rPr>
+                <w:strike/>
+              </w:rPr>
+            </w:pPr>
+            <w:r>
+              <w:rPr>
+                <w:strike/>
                 <w:color w:val="1A1A1A"/>
               </w:rPr>
               <w:t xml:space="preserve">  10. Créer une page 404 personnalisée avec liens de retour vers les pages clés</w:t>
@@ -8077,8 +8115,14 @@
             </w:tcMar>
           </w:tcPr>
           <w:p>
-            <w:r>
-              <w:rPr>
+            <w:pPr>
+              <w:rPr>
+                <w:strike/>
+              </w:rPr>
+            </w:pPr>
+            <w:r>
+              <w:rPr>
+                <w:strike/>
                 <w:color w:val="1A1A1A"/>
               </w:rPr>
               <w:t xml:space="preserve">  11. Ajouter des balises &lt;</w:t>
@@ -8086,6 +8130,7 @@
             <w:proofErr w:type="spellStart"/>
             <w:r>
               <w:rPr>
+                <w:strike/>
                 <w:color w:val="1A1A1A"/>
               </w:rPr>
               <w:t>lastmod</w:t>
@@ -8093,6 +8138,7 @@
             <w:proofErr w:type="spellEnd"/>
             <w:r>
               <w:rPr>
+                <w:strike/>
                 <w:color w:val="1A1A1A"/>
               </w:rPr>
               <w:t xml:space="preserve">&gt; dans le </w:t>
@@ -8100,6 +8146,7 @@
             <w:proofErr w:type="spellStart"/>
             <w:r>
               <w:rPr>
+                <w:strike/>
                 <w:color w:val="1A1A1A"/>
               </w:rPr>
               <w:t>sitemap</w:t>
@@ -8107,6 +8154,7 @@
             <w:proofErr w:type="spellEnd"/>
             <w:r>
               <w:rPr>
+                <w:strike/>
                 <w:color w:val="1A1A1A"/>
               </w:rPr>
               <w:t xml:space="preserve"> pour les pages majeures</w:t>
@@ -8133,8 +8181,14 @@
             </w:tcMar>
           </w:tcPr>
           <w:p>
-            <w:r>
-              <w:rPr>
+            <w:pPr>
+              <w:rPr>
+                <w:strike/>
+              </w:rPr>
+            </w:pPr>
+            <w:r>
+              <w:rPr>
+                <w:strike/>
                 <w:color w:val="1A1A1A"/>
               </w:rPr>
               <w:t xml:space="preserve">  12. Ajouter des fils d’Ariane HTML visibles sur les pages profondes</w:t>
@@ -8262,8 +8316,14 @@
             </w:tcMar>
           </w:tcPr>
           <w:p>
-            <w:r>
-              <w:rPr>
+            <w:pPr>
+              <w:rPr>
+                <w:strike/>
+              </w:rPr>
+            </w:pPr>
+            <w:r>
+              <w:rPr>
+                <w:strike/>
                 <w:color w:val="1A1A1A"/>
               </w:rPr>
               <w:t xml:space="preserve">  13. Lancer une stratégie blog : 2 articles/mois minimum, répondant aux requêtes </w:t>
@@ -8271,6 +8331,7 @@
             <w:proofErr w:type="spellStart"/>
             <w:r>
               <w:rPr>
+                <w:strike/>
                 <w:color w:val="1A1A1A"/>
               </w:rPr>
               <w:t>informaitonelles</w:t>
@@ -8298,15 +8359,28 @@
             </w:tcMar>
           </w:tcPr>
           <w:p>
+            <w:pPr>
+              <w:rPr>
+                <w:strike/>
+              </w:rPr>
+            </w:pPr>
             <w:r>
               <w:rPr>
                 <w:color w:val="1A1A1A"/>
               </w:rPr>
-              <w:t xml:space="preserve">  14. Ajouter des témoignages clients avec schéma </w:t>
+              <w:t xml:space="preserve">  </w:t>
+            </w:r>
+            <w:r>
+              <w:rPr>
+                <w:strike/>
+                <w:color w:val="1A1A1A"/>
+              </w:rPr>
+              <w:t xml:space="preserve">14. Ajouter des témoignages clients avec schéma </w:t>
             </w:r>
             <w:proofErr w:type="spellStart"/>
             <w:r>
               <w:rPr>
+                <w:strike/>
                 <w:color w:val="1A1A1A"/>
               </w:rPr>
               <w:t>Review</w:t>
@@ -8314,6 +8388,7 @@
             <w:proofErr w:type="spellEnd"/>
             <w:r>
               <w:rPr>
+                <w:strike/>
                 <w:color w:val="1A1A1A"/>
               </w:rPr>
               <w:t xml:space="preserve"> sur les pages clés</w:t>
@@ -8340,8 +8415,14 @@
             </w:tcMar>
           </w:tcPr>
           <w:p>
-            <w:r>
-              <w:rPr>
+            <w:pPr>
+              <w:rPr>
+                <w:strike/>
+              </w:rPr>
+            </w:pPr>
+            <w:r>
+              <w:rPr>
+                <w:strike/>
                 <w:color w:val="1A1A1A"/>
               </w:rPr>
               <w:t xml:space="preserve">  15. Créer une page Tarifs/Coût avec fourchettes de prix transparentes</w:t>
@@ -8368,15 +8449,28 @@
             </w:tcMar>
           </w:tcPr>
           <w:p>
+            <w:pPr>
+              <w:rPr>
+                <w:strike/>
+              </w:rPr>
+            </w:pPr>
             <w:r>
               <w:rPr>
                 <w:color w:val="1A1A1A"/>
               </w:rPr>
-              <w:t xml:space="preserve">  16. Ajouter un schéma Person pour les fondateurs de </w:t>
+              <w:t xml:space="preserve">  </w:t>
+            </w:r>
+            <w:r>
+              <w:rPr>
+                <w:strike/>
+                <w:color w:val="1A1A1A"/>
+              </w:rPr>
+              <w:t xml:space="preserve">16. Ajouter un schéma Person pour les fondateurs de </w:t>
             </w:r>
             <w:proofErr w:type="spellStart"/>
             <w:r>
               <w:rPr>
+                <w:strike/>
                 <w:color w:val="1A1A1A"/>
               </w:rPr>
               <w:t>Solarglobe</w:t>
@@ -8404,15 +8498,28 @@
             </w:tcMar>
           </w:tcPr>
           <w:p>
+            <w:pPr>
+              <w:rPr>
+                <w:strike/>
+              </w:rPr>
+            </w:pPr>
             <w:r>
               <w:rPr>
                 <w:color w:val="1A1A1A"/>
               </w:rPr>
-              <w:t xml:space="preserve">  17. Réduire la cannibalisation : merger /</w:t>
+              <w:t xml:space="preserve">  </w:t>
+            </w:r>
+            <w:r>
+              <w:rPr>
+                <w:strike/>
+                <w:color w:val="1A1A1A"/>
+              </w:rPr>
+              <w:t>17. Réduire la cannibalisation : merger /</w:t>
             </w:r>
             <w:proofErr w:type="spellStart"/>
             <w:r>
               <w:rPr>
+                <w:strike/>
                 <w:color w:val="1A1A1A"/>
               </w:rPr>
               <w:t>seo</w:t>
@@ -8420,6 +8527,7 @@
             <w:proofErr w:type="spellEnd"/>
             <w:r>
               <w:rPr>
+                <w:strike/>
                 <w:color w:val="1A1A1A"/>
               </w:rPr>
               <w:t xml:space="preserve">/ dans les pages piliers ou </w:t>
@@ -8427,6 +8535,7 @@
             <w:proofErr w:type="spellStart"/>
             <w:r>
               <w:rPr>
+                <w:strike/>
                 <w:color w:val="1A1A1A"/>
               </w:rPr>
               <w:t>noindex</w:t>

</xml_diff>